<commit_message>
Add Aunt Gail's birth year and living status
</commit_message>
<xml_diff>
--- a/Abbott_Family_History.docx
+++ b/Abbott_Family_History.docx
@@ -3846,7 +3846,7 @@
     </w:p>
     <w:p>
       <w:r>
-        <w:t xml:space="preserve">He had children — at least two, possibly more. The two known are </w:t>
+        <w:t xml:space="preserve">He had children — at least two. The eldest known is </w:t>
       </w:r>
       <w:r>
         <w:rPr>
@@ -3855,12 +3855,21 @@
         <w:t>Elizabeth Gail Abbott</w:t>
       </w:r>
       <w:r>
-        <w:t xml:space="preserve"> (the family memory-keeper, who supplied material to Mac's Senate biographer) and </w:t>
+        <w:t xml:space="preserve">, born in </w:t>
       </w:r>
       <w:r>
         <w:rPr>
           <w:b/>
         </w:rPr>
+        <w:t>1938</w:t>
+      </w:r>
+      <w:r>
+        <w:t xml:space="preserve"> and still living today, the family memory-keeper who supplied material to Mac's Senate biographer in the early 2000s. The second is </w:t>
+      </w:r>
+      <w:r>
+        <w:rPr>
+          <w:b/>
+        </w:rPr>
         <w:t>Timothy Kingsmill Abbott</w:t>
       </w:r>
       <w:r>
@@ -3873,7 +3882,7 @@
         <w:t>1947</w:t>
       </w:r>
       <w:r>
-        <w:t xml:space="preserve"> — Ben's father. The names of Bill's wife, of any other children he may have had, and of all but Tim of the next generation are not in the public record; they belong to the family's own knowledge.</w:t>
+        <w:t xml:space="preserve"> — Ben's father, and nine years Gail's junior. The name of Bill's wife (Ben's grandmother), of any other children he may have had between Gail and Tim or after, and of all of the next generation other than the two of them are not in the public record; they belong to the family's own knowledge.</w:t>
       </w:r>
     </w:p>
     <w:p>
@@ -3992,7 +4001,21 @@
         <w:t>Elizabeth Gail Abbott</w:t>
       </w:r>
       <w:r>
-        <w:t>, named in the Senate biography of her grandfather. Everything else is family knowledge.</w:t>
+        <w:t xml:space="preserve"> — born in </w:t>
+      </w:r>
+      <w:r>
+        <w:rPr>
+          <w:b/>
+        </w:rPr>
+        <w:t>1938</w:t>
+      </w:r>
+      <w:r>
+        <w:t xml:space="preserve"> and still living today — named in the Senate biography of her grandfather. Everything else is family knowledge.</w:t>
+      </w:r>
+    </w:p>
+    <w:p>
+      <w:r>
+        <w:t>Gail is, with her brother Tim, the oldest member of Ben's direct line alive in 2026. She is the only person living who knew Senator Mac Abbott (her grandfather, who lived until she was twenty-two) personally. Her first-hand recollections — already partially preserved in the 2004 Senate biography of Mac — are the irreplaceable bridge between the documented family of the political dynasty and the living family today. Any further work on this history should begin with her.</w:t>
       </w:r>
     </w:p>
     <w:p>
@@ -5458,7 +5481,7 @@
                 <w:rFonts w:ascii="Garamond" w:hAnsi="Garamond"/>
                 <w:sz w:val="20"/>
               </w:rPr>
-              <w:t xml:space="preserve">        Elizabeth Gail Abbott</w:t>
+              <w:t xml:space="preserve">        Elizabeth Gail Abbott (b.1938)</w:t>
             </w:r>
           </w:p>
         </w:tc>
@@ -5472,7 +5495,7 @@
                 <w:rFonts w:ascii="Garamond" w:hAnsi="Garamond"/>
                 <w:sz w:val="20"/>
               </w:rPr>
-              <w:t>Ben's aunt</w:t>
+              <w:t>Ben's aunt — living</w:t>
             </w:r>
           </w:p>
         </w:tc>

</xml_diff>

<commit_message>
Correct W.E.M. Abbott's nickname from Bill to Mac
</commit_message>
<xml_diff>
--- a/Abbott_Family_History.docx
+++ b/Abbott_Family_History.docx
@@ -2701,7 +2701,16 @@
         <w:t>William Edward Macartney</w:t>
       </w:r>
       <w:r>
-        <w:t xml:space="preserve"> (born 15 August 1906 — Ben's grandfather Bill) and </w:t>
+        <w:t xml:space="preserve"> (born 15 August 1906 — Ben's grandfather, who like his father was known in the family as </w:t>
+      </w:r>
+      <w:r>
+        <w:rPr>
+          <w:b/>
+        </w:rPr>
+        <w:t>Mac</w:t>
+      </w:r>
+      <w:r>
+        <w:t xml:space="preserve">) and </w:t>
       </w:r>
       <w:r>
         <w:rPr>
@@ -3786,106 +3795,153 @@
         <w:ind w:firstLine="0"/>
       </w:pPr>
       <w:r>
-        <w:t xml:space="preserve">Bill — formally </w:t>
-      </w:r>
-      <w:r>
         <w:rPr>
           <w:b/>
         </w:rPr>
         <w:t>William Edward Macartney Abbott</w:t>
       </w:r>
       <w:r>
-        <w:t xml:space="preserve"> — is the most recent generation in this history for whom there is a published memoir. He is also Ben's grandfather. The whole preceding story comes down to the present, in one sense, through him.</w:t>
+        <w:t xml:space="preserve"> — known in the family as </w:t>
+      </w:r>
+      <w:r>
+        <w:rPr>
+          <w:b/>
+        </w:rPr>
+        <w:t>Mac</w:t>
+      </w:r>
+      <w:r>
+        <w:t>, the second Mac in two consecutive generations — is the most recent figure in this history for whom there is a published memoir. He is also Ben's grandfather. The whole preceding story comes down to the present, in one sense, through him.</w:t>
       </w:r>
     </w:p>
     <w:p>
       <w:r>
-        <w:t xml:space="preserve">He was born on </w:t>
-      </w:r>
-      <w:r>
-        <w:rPr>
-          <w:b/>
-        </w:rPr>
-        <w:t>15 August 1906</w:t>
-      </w:r>
-      <w:r>
-        <w:t xml:space="preserve"> in Sydney, the eldest son of Senator Mac Abbott and Elizabeth Clare Hall. His upbringing was unusual in the family pattern. Unlike his father, his uncles, and his half-uncle J.H.M., </w:t>
-      </w:r>
-      <w:r>
-        <w:rPr>
-          <w:b/>
-        </w:rPr>
-        <w:t>Bill did not go to The King's School</w:t>
-      </w:r>
-      <w:r>
-        <w:t>. The Senate biography of his father records the fact as a deliberate departure from family tradition. He was educated locally and at home.</w:t>
+        <w:t xml:space="preserve">The shared nickname between father and son created a half-century of family disambiguation. From 1906 until 1960 there were two Macs in the immediate family — one a senator, the other a country grazier. Within the family they were distinguished as </w:t>
+      </w:r>
+      <w:r>
+        <w:rPr>
+          <w:i/>
+        </w:rPr>
+        <w:t>Senator Mac</w:t>
+      </w:r>
+      <w:r>
+        <w:t xml:space="preserve"> (the father) and simply </w:t>
+      </w:r>
+      <w:r>
+        <w:rPr>
+          <w:i/>
+        </w:rPr>
+        <w:t>Mac</w:t>
+      </w:r>
+      <w:r>
+        <w:t xml:space="preserve"> for the son; after the elder Mac's death in 1960 the younger carried the name alone. To avoid confusion in the rest of this history, I have called the elder Mac throughout </w:t>
+      </w:r>
+      <w:r>
+        <w:rPr>
+          <w:i/>
+        </w:rPr>
+        <w:t>Senator Mac</w:t>
+      </w:r>
+      <w:r>
+        <w:t xml:space="preserve"> and the younger simply by his initials W. E. M. or by </w:t>
+      </w:r>
+      <w:r>
+        <w:rPr>
+          <w:i/>
+        </w:rPr>
+        <w:t>Mac</w:t>
+      </w:r>
+      <w:r>
+        <w:t xml:space="preserve"> in this chapter.</w:t>
       </w:r>
     </w:p>
     <w:p>
       <w:r>
-        <w:t xml:space="preserve">He grew up between Sydney — at the family home in Turramurra — and the upper Hunter, where his father's pastoral interests were. In </w:t>
+        <w:t xml:space="preserve">He was born on </w:t>
       </w:r>
       <w:r>
         <w:rPr>
           <w:b/>
         </w:rPr>
-        <w:t>1927</w:t>
-      </w:r>
-      <w:r>
-        <w:t xml:space="preserve">, when his father bought </w:t>
+        <w:t>15 August 1906</w:t>
+      </w:r>
+      <w:r>
+        <w:t xml:space="preserve"> in Sydney, the eldest son of Senator Mac Abbott and Elizabeth Clare Hall. His upbringing was unusual in the family pattern. Unlike his father, his uncles, and his half-uncle J.H.M., </w:t>
       </w:r>
       <w:r>
         <w:rPr>
           <w:b/>
         </w:rPr>
-        <w:t>Tooloogan Vale</w:t>
-      </w:r>
-      <w:r>
-        <w:t xml:space="preserve"> at Scone, Bill was twenty-one. The property had been bought as an investment, run through a manager. By the time Bill was thirty it had become his life's work. He spent his adult years on the land, running sheep and cattle in the Scone district, the country at the base of the Liverpool Range that his great-grandmother Frances Amanda Brady had first seen in 1842.</w:t>
+        <w:t>W. E. M. did not go to The King's School</w:t>
+      </w:r>
+      <w:r>
+        <w:t>. The Senate biography of his father records the fact as a deliberate departure from family tradition. He was educated locally and at home.</w:t>
       </w:r>
     </w:p>
     <w:p>
       <w:r>
-        <w:t xml:space="preserve">He had children — at least two. The eldest known is </w:t>
+        <w:t xml:space="preserve">He grew up between Sydney — at the family home in Turramurra — and the upper Hunter, where his father's pastoral interests were. In </w:t>
       </w:r>
       <w:r>
         <w:rPr>
           <w:b/>
         </w:rPr>
-        <w:t>Elizabeth Gail Abbott</w:t>
-      </w:r>
-      <w:r>
-        <w:t xml:space="preserve">, born in </w:t>
+        <w:t>1927</w:t>
+      </w:r>
+      <w:r>
+        <w:t xml:space="preserve">, when Senator Mac bought </w:t>
       </w:r>
       <w:r>
         <w:rPr>
           <w:b/>
         </w:rPr>
-        <w:t>1938</w:t>
-      </w:r>
-      <w:r>
-        <w:t xml:space="preserve"> and still living today, the family memory-keeper who supplied material to Mac's Senate biographer in the early 2000s. The second is </w:t>
-      </w:r>
-      <w:r>
-        <w:rPr>
-          <w:b/>
-        </w:rPr>
-        <w:t>Timothy Kingsmill Abbott</w:t>
-      </w:r>
-      <w:r>
-        <w:t xml:space="preserve">, born in </w:t>
-      </w:r>
-      <w:r>
-        <w:rPr>
-          <w:b/>
-        </w:rPr>
-        <w:t>1947</w:t>
-      </w:r>
-      <w:r>
-        <w:t xml:space="preserve"> — Ben's father, and nine years Gail's junior. The name of Bill's wife (Ben's grandmother), of any other children he may have had between Gail and Tim or after, and of all of the next generation other than the two of them are not in the public record; they belong to the family's own knowledge.</w:t>
+        <w:t>Tooloogan Vale</w:t>
+      </w:r>
+      <w:r>
+        <w:t xml:space="preserve"> at Scone, W. E. M. was twenty-one. The property had been bought as an investment, run through a manager. By the time he was thirty it had become his life's work. He spent his adult years on the land, running sheep and cattle in the Scone district, the country at the base of the Liverpool Range that his great-grandmother Frances Amanda Brady had first seen in 1842.</w:t>
       </w:r>
     </w:p>
     <w:p>
+      <w:r>
+        <w:t xml:space="preserve">He had children — at least two. The eldest known is </w:t>
+      </w:r>
+      <w:r>
+        <w:rPr>
+          <w:b/>
+        </w:rPr>
+        <w:t>Elizabeth Gail Abbott</w:t>
+      </w:r>
+      <w:r>
+        <w:t xml:space="preserve">, born in </w:t>
+      </w:r>
+      <w:r>
+        <w:rPr>
+          <w:b/>
+        </w:rPr>
+        <w:t>1938</w:t>
+      </w:r>
+      <w:r>
+        <w:t xml:space="preserve"> and still living today, the family memory-keeper who supplied material to Senator Mac's Senate biographer in the early 2000s. The second is </w:t>
+      </w:r>
+      <w:r>
+        <w:rPr>
+          <w:b/>
+        </w:rPr>
+        <w:t>Timothy Kingsmill Abbott</w:t>
+      </w:r>
+      <w:r>
+        <w:t xml:space="preserve">, born in </w:t>
+      </w:r>
+      <w:r>
+        <w:rPr>
+          <w:b/>
+        </w:rPr>
+        <w:t>1947</w:t>
+      </w:r>
+      <w:r>
+        <w:t xml:space="preserve"> — Ben's father, and nine years Gail's junior. The name of Mac's wife (Ben's grandmother), of any other children he may have had between Gail and Tim or after, and of all of the next generation other than the two of them are not in the public record; they belong to the family's own knowledge.</w:t>
+      </w:r>
+    </w:p>
+    <w:p>
       <w:pPr>
         <w:pStyle w:val="FH_SubHead"/>
         <w:jc w:val="center"/>
@@ -3908,7 +3964,7 @@
         <w:t>1987</w:t>
       </w:r>
       <w:r>
-        <w:t xml:space="preserve"> — aged eighty-one — Bill published a memoir of his upbringing at Tooloogan Vale through the Scone and Upper Hunter Historical Society. He called it *</w:t>
+        <w:t xml:space="preserve"> — aged eighty-one — W. E. M. published a memoir of his upbringing at Tooloogan Vale through the Scone and Upper Hunter Historical Society. He called it *</w:t>
       </w:r>
       <w:r>
         <w:rPr>
@@ -3937,7 +3993,7 @@
         <w:t>'one family member recalled he had a lovely soft speaking voice and delighted in telling stories to his grandchildren.'</w:t>
       </w:r>
       <w:r>
-        <w:t xml:space="preserve"> The family member was Bill's daughter Gail. Bill's own voice, in the memoir, is heard recalling his father in his old age in the years they shared at Tooloogan.</w:t>
+        <w:t xml:space="preserve"> The family member was W. E. M.'s daughter Gail. The younger Mac's own voice, in the memoir, is heard recalling his father in his old age in the years they shared at Tooloogan.</w:t>
       </w:r>
     </w:p>
     <w:p>
@@ -4334,7 +4390,7 @@
         <w:ind w:firstLine="0"/>
       </w:pPr>
       <w:r>
-        <w:t xml:space="preserve">Pastoral property near Scone, NSW, bought by Senator Mac Abbott in 1927 and run by him with a manager. Bill (W.E.M.) Abbott's home — the setting of his published memoir </w:t>
+        <w:t xml:space="preserve">Pastoral property near Scone, NSW, bought by Senator Mac Abbott in 1927 and run by him with a manager. W. E. M. (the younger Mac) Abbott's home — the setting of his published memoir </w:t>
       </w:r>
       <w:r>
         <w:rPr>
@@ -4773,7 +4829,7 @@
         <w:t>Macartney</w:t>
       </w:r>
       <w:r>
-        <w:t xml:space="preserve"> Abbott (b.1976) — Bill's grandson, Ben's brother</w:t>
+        <w:t xml:space="preserve"> Abbott (b.1976) — the younger Mac's grandson, Ben's brother</w:t>
       </w:r>
     </w:p>
     <w:p>
@@ -5451,7 +5507,7 @@
                 <w:rFonts w:ascii="Garamond" w:hAnsi="Garamond"/>
                 <w:sz w:val="20"/>
               </w:rPr>
-              <w:t>Bill — Ben's grandfather; m. [unknown]</w:t>
+              <w:t>Known as Mac — Ben's grandfather; m. [unknown]</w:t>
             </w:r>
           </w:p>
         </w:tc>
@@ -6070,7 +6126,7 @@
         <w:rPr>
           <w:sz w:val="21"/>
         </w:rPr>
-        <w:t>Abbott, W. E. M. (Bill). The Contented Years: Living at Tooloogan Half a Century Ago. Scone &amp; Upper Hunter Historical Society, 1987.</w:t>
+        <w:t>Abbott, W. E. M. The Contented Years: Living at Tooloogan Half a Century Ago. Scone &amp; Upper Hunter Historical Society, 1987.</w:t>
       </w:r>
     </w:p>
     <w:p>

</xml_diff>